<commit_message>
Update Pre Project Plan
</commit_message>
<xml_diff>
--- a/docs/phase1/01-project-plan/Team_EV_Preliminary_Project_Plan.docx
+++ b/docs/phase1/01-project-plan/Team_EV_Preliminary_Project_Plan.docx
@@ -111,8 +111,6 @@
         </w:rPr>
         <w:t>17</w:t>
       </w:r>
-      <w:bookmarkStart w:id="18" w:name="_GoBack"/>
-      <w:bookmarkEnd w:id="18"/>
       <w:r>
         <w:t>, 2026</w:t>
       </w:r>
@@ -5662,12 +5660,6 @@
             <w:insideH w:val="single" w:color="auto" w:sz="6" w:space="0"/>
             <w:insideV w:val="single" w:color="auto" w:sz="6" w:space="0"/>
           </w:tblBorders>
-          <w:tblCellMar>
-            <w:top w:w="0" w:type="dxa"/>
-            <w:left w:w="108" w:type="dxa"/>
-            <w:bottom w:w="0" w:type="dxa"/>
-            <w:right w:w="108" w:type="dxa"/>
-          </w:tblCellMar>
         </w:tblPrEx>
         <w:trPr>
           <w:cantSplit/>
@@ -5980,7 +5972,10 @@
               <w:pStyle w:val="31"/>
             </w:pPr>
             <w:r>
-              <w:t>Member B</w:t>
+              <w:rPr>
+                <w:rFonts w:hint="eastAsia"/>
+              </w:rPr>
+              <w:t>James Zuniga</w:t>
             </w:r>
           </w:p>
         </w:tc>
@@ -5993,7 +5988,10 @@
               <w:pStyle w:val="31"/>
             </w:pPr>
             <w:r>
-              <w:t>Member E</w:t>
+              <w:rPr>
+                <w:rFonts w:hint="eastAsia"/>
+              </w:rPr>
+              <w:t>Young Kim</w:t>
             </w:r>
           </w:p>
         </w:tc>
@@ -6053,7 +6051,10 @@
               <w:pStyle w:val="31"/>
             </w:pPr>
             <w:r>
-              <w:t>Member C</w:t>
+              <w:rPr>
+                <w:rFonts w:hint="eastAsia"/>
+              </w:rPr>
+              <w:t>Austin Aragon</w:t>
             </w:r>
           </w:p>
         </w:tc>
@@ -6134,7 +6135,10 @@
               <w:pStyle w:val="31"/>
             </w:pPr>
             <w:r>
-              <w:t>Member D</w:t>
+              <w:rPr>
+                <w:rFonts w:hint="eastAsia"/>
+              </w:rPr>
+              <w:t>Justus Jones</w:t>
             </w:r>
           </w:p>
         </w:tc>
@@ -6147,7 +6151,10 @@
               <w:pStyle w:val="31"/>
             </w:pPr>
             <w:r>
-              <w:t>Member C</w:t>
+              <w:rPr>
+                <w:rFonts w:hint="eastAsia"/>
+              </w:rPr>
+              <w:t>Austin Aragon</w:t>
             </w:r>
           </w:p>
         </w:tc>
@@ -6207,7 +6214,10 @@
               <w:pStyle w:val="31"/>
             </w:pPr>
             <w:r>
-              <w:t>Member E</w:t>
+              <w:rPr>
+                <w:rFonts w:hint="eastAsia"/>
+              </w:rPr>
+              <w:t>Young Kim</w:t>
             </w:r>
           </w:p>
         </w:tc>
@@ -6220,7 +6230,10 @@
               <w:pStyle w:val="31"/>
             </w:pPr>
             <w:r>
-              <w:t>Member B</w:t>
+              <w:rPr>
+                <w:rFonts w:hint="eastAsia"/>
+              </w:rPr>
+              <w:t>James Zuniga</w:t>
             </w:r>
           </w:p>
         </w:tc>
@@ -6297,7 +6310,10 @@
               <w:pStyle w:val="31"/>
             </w:pPr>
             <w:r>
-              <w:t>Member D</w:t>
+              <w:rPr>
+                <w:rFonts w:hint="eastAsia"/>
+              </w:rPr>
+              <w:t>Justus Jones</w:t>
             </w:r>
           </w:p>
         </w:tc>
@@ -6374,7 +6390,10 @@
               <w:pStyle w:val="31"/>
             </w:pPr>
             <w:r>
-              <w:t>Member B</w:t>
+              <w:rPr>
+                <w:rFonts w:hint="eastAsia"/>
+              </w:rPr>
+              <w:t>James Zuniga</w:t>
             </w:r>
           </w:p>
         </w:tc>
@@ -6457,7 +6476,12 @@
         <w:t>Shared responsibility — the issues list.</w:t>
       </w:r>
       <w:r>
-        <w:t xml:space="preserve"> Every member contributes at least three candidate issues from the Preliminary Definition during the elicitation week (§5, W2). This is what keeps D-2 from being one person's opinion, and it is a bounded ask: roughly thirty minutes per member.</w:t>
+        <w:t xml:space="preserve"> Every member contributes at least three candidate issues from the Preliminary Definition during the elicitation week (§5, W2). This is what keeps D-2 from being one person's opinion</w:t>
+      </w:r>
+      <w:bookmarkStart w:id="18" w:name="_GoBack"/>
+      <w:bookmarkEnd w:id="18"/>
+      <w:r>
+        <w:t>.</w:t>
       </w:r>
     </w:p>
     <w:p>
@@ -7246,14 +7270,6 @@
       </w:tr>
       <w:tr>
         <w:tblPrEx>
-          <w:tblBorders>
-            <w:top w:val="single" w:color="auto" w:sz="12" w:space="0"/>
-            <w:left w:val="single" w:color="auto" w:sz="12" w:space="0"/>
-            <w:bottom w:val="single" w:color="auto" w:sz="12" w:space="0"/>
-            <w:right w:val="single" w:color="auto" w:sz="12" w:space="0"/>
-            <w:insideH w:val="single" w:color="auto" w:sz="6" w:space="0"/>
-            <w:insideV w:val="single" w:color="auto" w:sz="6" w:space="0"/>
-          </w:tblBorders>
           <w:tblCellMar>
             <w:top w:w="0" w:type="dxa"/>
             <w:left w:w="108" w:type="dxa"/>
@@ -8871,6 +8887,13 @@
               <w:t>Zichuo Wang</w:t>
             </w:r>
             <w:r>
+              <w:rPr>
+                <w:rFonts w:hint="default" w:eastAsia="宋体"/>
+                <w:lang w:val="en-US" w:eastAsia="zh-CN"/>
+              </w:rPr>
+              <w:t xml:space="preserve"> </w:t>
+            </w:r>
+            <w:r>
               <w:t>(all review)</w:t>
             </w:r>
           </w:p>
@@ -8952,7 +8975,7 @@
               <w:pStyle w:val="31"/>
             </w:pPr>
             <w:r>
-              <w:t>All members read the Preliminary Definition and the World Assumptions Masterlist; each logs ≥3 candidate issues; team consolidates the issues list and records scope assumptions (AS-1). In parallel, candidate AS-IS/TO-BE scenarios are proposed and the three distinct pairs are selected — pulled forward into W2 because D-1 and D-4 both depend on them and the phase has no slack to spare</w:t>
+              <w:t>All members read the Preliminary Definition and the World Assumptions Masterlist; each logs ≥3 candidate issues; team consolidates the issues list and records scope assumptions (AS-1). In parallel, candidate AS-IS/TO-BE scenarios are proposed and the three distinct pairs are selected — pulled forward into W2 because D-1 and D-4 both depend on them</w:t>
             </w:r>
           </w:p>
         </w:tc>
@@ -8965,7 +8988,22 @@
               <w:pStyle w:val="31"/>
             </w:pPr>
             <w:r>
-              <w:t>All; consolidated by Member C; scenarios by Member B</w:t>
+              <w:t xml:space="preserve">All; consolidated by </w:t>
+            </w:r>
+            <w:r>
+              <w:rPr>
+                <w:rFonts w:hint="eastAsia"/>
+              </w:rPr>
+              <w:t>Austin Aragon</w:t>
+            </w:r>
+            <w:r>
+              <w:t xml:space="preserve">; scenarios by </w:t>
+            </w:r>
+            <w:r>
+              <w:rPr>
+                <w:rFonts w:hint="eastAsia"/>
+              </w:rPr>
+              <w:t>James Zuniga</w:t>
             </w:r>
           </w:p>
         </w:tc>
@@ -9059,7 +9097,68 @@
               <w:pStyle w:val="31"/>
             </w:pPr>
             <w:r>
-              <w:t>Member C (D-2); Member D (D-3); Member B (D-1); Member E (D-4)</w:t>
+              <w:rPr>
+                <w:rFonts w:hint="default"/>
+                <w:lang w:val="en-US"/>
+              </w:rPr>
+              <w:t xml:space="preserve"> </w:t>
+            </w:r>
+            <w:r>
+              <w:rPr>
+                <w:rFonts w:hint="eastAsia"/>
+              </w:rPr>
+              <w:t>Austin Aragon</w:t>
+            </w:r>
+            <w:r>
+              <w:t xml:space="preserve"> (D-2); </w:t>
+            </w:r>
+            <w:r>
+              <w:rPr>
+                <w:rFonts w:hint="eastAsia"/>
+              </w:rPr>
+              <w:t>Justus Jones</w:t>
+            </w:r>
+            <w:r>
+              <w:t xml:space="preserve"> (D-3);</w:t>
+            </w:r>
+            <w:r>
+              <w:rPr>
+                <w:rFonts w:hint="default"/>
+                <w:lang w:val="en-US"/>
+              </w:rPr>
+              <w:t xml:space="preserve"> </w:t>
+            </w:r>
+            <w:r>
+              <w:rPr>
+                <w:rFonts w:hint="eastAsia"/>
+              </w:rPr>
+              <w:t>James Zuniga</w:t>
+            </w:r>
+            <w:r>
+              <w:rPr>
+                <w:rFonts w:hint="default"/>
+                <w:lang w:val="en-US"/>
+              </w:rPr>
+              <w:t xml:space="preserve"> </w:t>
+            </w:r>
+            <w:r>
+              <w:t>(D-1)</w:t>
+            </w:r>
+            <w:r>
+              <w:rPr>
+                <w:rFonts w:hint="default"/>
+                <w:lang w:val="en-US"/>
+              </w:rPr>
+              <w:t xml:space="preserve">; </w:t>
+            </w:r>
+            <w:r>
+              <w:rPr>
+                <w:rFonts w:hint="eastAsia"/>
+              </w:rPr>
+              <w:t>Young Kim</w:t>
+            </w:r>
+            <w:r>
+              <w:t xml:space="preserve"> (D-4)</w:t>
             </w:r>
           </w:p>
         </w:tc>
@@ -9153,7 +9252,31 @@
               <w:pStyle w:val="31"/>
             </w:pPr>
             <w:r>
-              <w:t>Member D (D-3); Member B (D-1); Member E (D-4); all review</w:t>
+              <w:rPr>
+                <w:rFonts w:hint="eastAsia"/>
+              </w:rPr>
+              <w:t>Justus Jones</w:t>
+            </w:r>
+            <w:r>
+              <w:t xml:space="preserve"> (D-3); </w:t>
+            </w:r>
+            <w:r>
+              <w:rPr>
+                <w:rFonts w:hint="eastAsia"/>
+              </w:rPr>
+              <w:t>James Zuniga</w:t>
+            </w:r>
+            <w:r>
+              <w:t xml:space="preserve"> (D-1); </w:t>
+            </w:r>
+            <w:r>
+              <w:rPr>
+                <w:rFonts w:hint="eastAsia"/>
+              </w:rPr>
+              <w:t>Young Kim</w:t>
+            </w:r>
+            <w:r>
+              <w:t xml:space="preserve"> (D-4); all review</w:t>
             </w:r>
           </w:p>
         </w:tc>
@@ -9872,7 +9995,7 @@
   <w:docDefaults>
     <w:rPrDefault>
       <w:rPr>
-        <w:rFonts w:ascii="Times New Roman" w:hAnsi="Times New Roman" w:eastAsia="Times New Roman" w:cs="Times New Roman"/>
+        <w:rFonts w:ascii="Times New Roman" w:hAnsi="Times New Roman" w:eastAsia="宋体" w:cs="Times New Roman"/>
       </w:rPr>
     </w:rPrDefault>
     <w:pPrDefault/>
@@ -9897,19 +10020,19 @@
     <w:lsdException w:uiPriority="99" w:name="index 7"/>
     <w:lsdException w:uiPriority="99" w:name="index 8"/>
     <w:lsdException w:uiPriority="99" w:name="index 9"/>
-    <w:lsdException w:unhideWhenUsed="0" w:uiPriority="39" w:semiHidden="0" w:name="toc 1"/>
-    <w:lsdException w:unhideWhenUsed="0" w:uiPriority="39" w:semiHidden="0" w:name="toc 2"/>
+    <w:lsdException w:qFormat="1" w:unhideWhenUsed="0" w:uiPriority="39" w:semiHidden="0" w:name="toc 1"/>
+    <w:lsdException w:qFormat="1" w:unhideWhenUsed="0" w:uiPriority="39" w:semiHidden="0" w:name="toc 2"/>
     <w:lsdException w:unhideWhenUsed="0" w:uiPriority="0" w:name="toc 3"/>
-    <w:lsdException w:unhideWhenUsed="0" w:uiPriority="0" w:name="toc 4"/>
+    <w:lsdException w:qFormat="1" w:unhideWhenUsed="0" w:uiPriority="0" w:name="toc 4"/>
     <w:lsdException w:unhideWhenUsed="0" w:uiPriority="0" w:name="toc 5"/>
-    <w:lsdException w:unhideWhenUsed="0" w:uiPriority="0" w:name="toc 6"/>
+    <w:lsdException w:qFormat="1" w:unhideWhenUsed="0" w:uiPriority="0" w:name="toc 6"/>
     <w:lsdException w:qFormat="1" w:unhideWhenUsed="0" w:uiPriority="0" w:name="toc 7"/>
     <w:lsdException w:qFormat="1" w:unhideWhenUsed="0" w:uiPriority="0" w:name="toc 8"/>
-    <w:lsdException w:unhideWhenUsed="0" w:uiPriority="0" w:name="toc 9"/>
+    <w:lsdException w:qFormat="1" w:unhideWhenUsed="0" w:uiPriority="0" w:name="toc 9"/>
     <w:lsdException w:uiPriority="99" w:name="Normal Indent"/>
     <w:lsdException w:uiPriority="99" w:name="footnote text"/>
     <w:lsdException w:uiPriority="99" w:name="annotation text"/>
-    <w:lsdException w:unhideWhenUsed="0" w:uiPriority="0" w:semiHidden="0" w:name="header"/>
+    <w:lsdException w:qFormat="1" w:unhideWhenUsed="0" w:uiPriority="0" w:semiHidden="0" w:name="header"/>
     <w:lsdException w:qFormat="1" w:unhideWhenUsed="0" w:uiPriority="0" w:semiHidden="0" w:name="footer"/>
     <w:lsdException w:uiPriority="99" w:name="index heading"/>
     <w:lsdException w:qFormat="1" w:uiPriority="35" w:name="caption"/>
@@ -10355,6 +10478,7 @@
   <w:style w:type="paragraph" w:styleId="13">
     <w:name w:val="header"/>
     <w:basedOn w:val="1"/>
+    <w:qFormat/>
     <w:uiPriority w:val="0"/>
     <w:pPr>
       <w:tabs>
@@ -10372,6 +10496,7 @@
     <w:basedOn w:val="1"/>
     <w:next w:val="1"/>
     <w:autoRedefine/>
+    <w:qFormat/>
     <w:uiPriority w:val="39"/>
     <w:pPr>
       <w:tabs>
@@ -10390,6 +10515,7 @@
     <w:next w:val="1"/>
     <w:autoRedefine/>
     <w:semiHidden/>
+    <w:qFormat/>
     <w:uiPriority w:val="0"/>
     <w:pPr>
       <w:ind w:left="720"/>
@@ -10401,6 +10527,7 @@
     <w:next w:val="1"/>
     <w:autoRedefine/>
     <w:semiHidden/>
+    <w:qFormat/>
     <w:uiPriority w:val="0"/>
     <w:pPr>
       <w:ind w:left="1200"/>
@@ -10411,6 +10538,7 @@
     <w:basedOn w:val="1"/>
     <w:next w:val="1"/>
     <w:autoRedefine/>
+    <w:qFormat/>
     <w:uiPriority w:val="39"/>
     <w:pPr>
       <w:tabs>
@@ -10427,6 +10555,7 @@
     <w:next w:val="1"/>
     <w:autoRedefine/>
     <w:semiHidden/>
+    <w:qFormat/>
     <w:uiPriority w:val="0"/>
     <w:pPr>
       <w:ind w:left="1920"/>

</xml_diff>